<commit_message>
Update AI Workspace section to use Paseo ADE and remove Willow Voice
</commit_message>
<xml_diff>
--- a/Chokkar_Gurusamy_Resume.docx
+++ b/Chokkar_Gurusamy_Resume.docx
@@ -1653,10 +1653,10 @@
         <w:rPr>
           <w:b/>
         </w:rPr>
-        <w:t>Paseo CLI</w:t>
+        <w:t>Paseo ADE</w:t>
       </w:r>
       <w:r>
-        <w:t xml:space="preserve"> for ACP agent orchestration (Codex, Claude Code), alongside Kiro-CLI, OpenCode, and Willow Voice.</w:t>
+        <w:t xml:space="preserve"> for ACP agent orchestration (Codex, Claude Code), alongside Kiro-CLI, and OpenCode.</w:t>
       </w:r>
     </w:p>
     <w:p>

</xml_diff>

<commit_message>
Merge AI Workspace bullets into a single line and remove testing
</commit_message>
<xml_diff>
--- a/Chokkar_Gurusamy_Resume.docx
+++ b/Chokkar_Gurusamy_Resume.docx
@@ -1656,16 +1656,7 @@
         <w:t>Paseo ADE</w:t>
       </w:r>
       <w:r>
-        <w:t xml:space="preserve"> for ACP agent orchestration (Codex, Claude Code), alongside Kiro-CLI, and OpenCode.</w:t>
-      </w:r>
-    </w:p>
-    <w:p>
-      <w:pPr>
-        <w:pStyle w:val="ListBullet"/>
-        <w:spacing w:before="0" w:after="50" w:line="276" w:lineRule="auto"/>
-      </w:pPr>
-      <w:r>
-        <w:t>Configure agentic skills (such as superpowers) and custom MCP servers to automate coding, testing, and workspace workflows.</w:t>
+        <w:t xml:space="preserve"> for ACP agent orchestration (Codex, Claude Code) alongside Kiro-CLI, and OpenCode, configuring agentic skills (such as superpowers) and custom MCP servers to automate coding and workspace workflows.</w:t>
       </w:r>
     </w:p>
     <w:sectPr>

</xml_diff>

<commit_message>
Split AI Workspace section back into two bullet points
</commit_message>
<xml_diff>
--- a/Chokkar_Gurusamy_Resume.docx
+++ b/Chokkar_Gurusamy_Resume.docx
@@ -1656,7 +1656,16 @@
         <w:t>Paseo ADE</w:t>
       </w:r>
       <w:r>
-        <w:t xml:space="preserve"> for ACP agent orchestration (Codex, Claude Code) alongside Kiro-CLI, and OpenCode, configuring agentic skills (such as superpowers) and custom MCP servers to automate coding and workspace workflows.</w:t>
+        <w:t xml:space="preserve"> for ACP agent orchestration (Codex, Claude Code) alongside Kiro-CLI, and OpenCode.</w:t>
+      </w:r>
+    </w:p>
+    <w:p>
+      <w:pPr>
+        <w:pStyle w:val="ListBullet"/>
+        <w:spacing w:before="0" w:after="50" w:line="276" w:lineRule="auto"/>
+      </w:pPr>
+      <w:r>
+        <w:t>Configure agentic skills (such as superpowers) and custom MCP servers to automate coding and workspace workflows.</w:t>
       </w:r>
     </w:p>
     <w:sectPr>

</xml_diff>

<commit_message>
Optimize vertical spacing at the end of the resume
</commit_message>
<xml_diff>
--- a/Chokkar_Gurusamy_Resume.docx
+++ b/Chokkar_Gurusamy_Resume.docx
@@ -1552,18 +1552,66 @@
         <w:t>CERTIFICATIONS</w:t>
       </w:r>
     </w:p>
-    <w:p>
-      <w:pPr>
-        <w:spacing w:before="40" w:after="40"/>
-        <w:ind w:left="216"/>
-      </w:pPr>
-      <w:r>
-        <w:rPr>
-          <w:b/>
-        </w:rPr>
-        <w:t>Google Cloud Professional Data Engineer</w:t>
-      </w:r>
-    </w:p>
+    <w:tbl>
+      <w:tblPr>
+        <w:tblW w:type="auto" w:w="0"/>
+        <w:jc w:val="center"/>
+        <w:tblLayout w:type="fixed"/>
+        <w:tblLook w:firstColumn="1" w:firstRow="1" w:lastColumn="0" w:lastRow="0" w:noHBand="0" w:noVBand="1" w:val="04A0"/>
+      </w:tblPr>
+      <w:tblGrid>
+        <w:gridCol w:w="7488"/>
+        <w:gridCol w:w="2880"/>
+      </w:tblGrid>
+      <w:tr>
+        <w:tc>
+          <w:tcPr>
+            <w:tcW w:type="dxa" w:w="5184"/>
+            <w:tcMar>
+              <w:top w:w="0" w:type="dxa"/>
+              <w:bottom w:w="0" w:type="dxa"/>
+              <w:left w:w="0" w:type="dxa"/>
+              <w:right w:w="0" w:type="dxa"/>
+            </w:tcMar>
+          </w:tcPr>
+          <w:p>
+            <w:pPr>
+              <w:spacing w:before="80" w:after="40"/>
+            </w:pPr>
+            <w:r>
+              <w:rPr>
+                <w:b/>
+                <w:i w:val="0"/>
+              </w:rPr>
+              <w:t>Google Cloud Professional Data Engineer</w:t>
+            </w:r>
+          </w:p>
+        </w:tc>
+        <w:tc>
+          <w:tcPr>
+            <w:tcW w:type="dxa" w:w="5184"/>
+            <w:tcMar>
+              <w:top w:w="0" w:type="dxa"/>
+              <w:bottom w:w="0" w:type="dxa"/>
+              <w:left w:w="0" w:type="dxa"/>
+              <w:right w:w="0" w:type="dxa"/>
+            </w:tcMar>
+          </w:tcPr>
+          <w:p>
+            <w:pPr>
+              <w:spacing w:before="80" w:after="40"/>
+              <w:jc w:val="right"/>
+            </w:pPr>
+            <w:r>
+              <w:rPr>
+                <w:b/>
+                <w:i w:val="0"/>
+              </w:rPr>
+            </w:r>
+          </w:p>
+        </w:tc>
+      </w:tr>
+    </w:tbl>
     <w:p>
       <w:pPr>
         <w:keepNext/>

</xml_diff>

<commit_message>
Add DISH App Store project under DPA section and rename heading
</commit_message>
<xml_diff>
--- a/Chokkar_Gurusamy_Resume.docx
+++ b/Chokkar_Gurusamy_Resume.docx
@@ -836,7 +836,7 @@
                 <w:b/>
                 <w:i w:val="0"/>
               </w:rPr>
-              <w:t>Dish Paperless Agreement (DPA), STB Health &amp; Field Catalogue</w:t>
+              <w:t>Dish Paperless Agreement (DPA), STB Health, Field Catalogue &amp; App Store</w:t>
             </w:r>
           </w:p>
         </w:tc>
@@ -944,6 +944,21 @@
       </w:r>
       <w:r>
         <w:t>, while the integrated CMS sync cut catalog update delivery time from weeks to minutes.</w:t>
+      </w:r>
+    </w:p>
+    <w:p>
+      <w:pPr>
+        <w:pStyle w:val="ListBullet"/>
+        <w:spacing w:before="0" w:after="50" w:line="276" w:lineRule="auto"/>
+      </w:pPr>
+      <w:r>
+        <w:rPr>
+          <w:b/>
+        </w:rPr>
+        <w:t>DISH App Store:</w:t>
+      </w:r>
+      <w:r>
+        <w:t xml:space="preserve"> Custom-built internal enterprise app distribution platform (Lambda + DynamoDB + React) that delivers iOS/Android builds to DISH employees, technicians, and retailers via OTA installation with Okta SSO and group-based access control.</w:t>
       </w:r>
     </w:p>
     <w:tbl>

</xml_diff>

<commit_message>
Remove global delivery models bullet point under Sling TV section
</commit_message>
<xml_diff>
--- a/Chokkar_Gurusamy_Resume.docx
+++ b/Chokkar_Gurusamy_Resume.docx
@@ -794,15 +794,6 @@
       </w:r>
       <w:r>
         <w:t>.</w:t>
-      </w:r>
-    </w:p>
-    <w:p>
-      <w:pPr>
-        <w:pStyle w:val="ListBullet"/>
-        <w:spacing w:before="0" w:after="50" w:line="276" w:lineRule="auto"/>
-      </w:pPr>
-      <w:r>
-        <w:t>Restructured global delivery models, empowering offshore teams in India to take full ownership of feature execution, significantly increasing throughput and operational readiness.</w:t>
       </w:r>
     </w:p>
     <w:tbl>

</xml_diff>

<commit_message>
update: remove GitHub link, merge location to contact line, STB bullet rewrite, DPA heading restored, spacing tweaks
</commit_message>
<xml_diff>
--- a/Chokkar_Gurusamy_Resume.docx
+++ b/Chokkar_Gurusamy_Resume.docx
@@ -26,7 +26,7 @@
           <w:color w:val="475569"/>
           <w:sz w:val="20"/>
         </w:rPr>
-        <w:t>Bangalore, India (On-site / Hybrid)</w:t>
+        <w:t>Bangalore, India</w:t>
       </w:r>
     </w:p>
     <w:p>
@@ -67,20 +67,6 @@
           <w:u w:val="single"/>
         </w:rPr>
         <w:t>linkedin.com/in/chokkarg</w:t>
-      </w:r>
-      <w:r>
-        <w:rPr>
-          <w:color w:val="475569"/>
-        </w:rPr>
-        <w:t xml:space="preserve">   |   </w:t>
-      </w:r>
-      <w:r>
-        <w:rPr>
-          <w:color w:val="2563EB"/>
-          <w:sz w:val="19"/>
-          <w:u w:val="single"/>
-        </w:rPr>
-        <w:t>github.com/kvginnovate</w:t>
       </w:r>
     </w:p>
     <w:p>
@@ -794,6 +780,15 @@
       </w:r>
       <w:r>
         <w:t>.</w:t>
+      </w:r>
+    </w:p>
+    <w:p>
+      <w:pPr>
+        <w:pStyle w:val="ListBullet"/>
+        <w:spacing w:before="0" w:after="50" w:line="276" w:lineRule="auto"/>
+      </w:pPr>
+      <w:r>
+        <w:t>Designed and implemented resilient Kafka event-driven architectures for payment and billing events, ensuring zero-loss message delivery across subscriber services.</w:t>
       </w:r>
     </w:p>
     <w:tbl>

</xml_diff>